<commit_message>
Replace stale email-verification screenshot in user guide v1.15
Swaps in WJ's screenshot of the corrected "Email verified" screen (Sign in button, per D-012) in place of the pre-D-012 "Go to my dashboard" screenshot.

Co-Authored-By: Claude Sonnet 5 <noreply@anthropic.com>
</commit_message>
<xml_diff>
--- a/docs/User Guide/grant-pathway-user-guide-v1.15.docx
+++ b/docs/User Guide/grant-pathway-user-guide-v1.15.docx
@@ -4178,7 +4178,7 @@
         </w:rPr>
         <w:drawing>
           <wp:inline distT="0" distB="0" distL="0" distR="0" wp14:anchorId="2D6202A7" wp14:editId="2D6202A8">
-            <wp:extent cx="5905500" cy="4152900"/>
+            <wp:extent cx="5905500" cy="3930711"/>
             <wp:effectExtent l="0" t="0" r="0" b="0"/>
             <wp:docPr id="900000002" name="The Email verified screen with the Sign in button" descr="The Email verified screen with the Sign in button" title="The Email verified screen with the Sign in button"/>
             <wp:cNvGraphicFramePr>
@@ -4203,7 +4203,7 @@
                   <pic:spPr bwMode="auto">
                     <a:xfrm>
                       <a:off x="0" y="0"/>
-                      <a:ext cx="5905500" cy="4152900"/>
+                      <a:ext cx="5905500" cy="3930711"/>
                     </a:xfrm>
                     <a:prstGeom prst="rect">
                       <a:avLst/>

</xml_diff>